<commit_message>
Implement Part 1 Family Court form updates
</commit_message>
<xml_diff>
--- a/templates/Application for Confidential address 1.docx
+++ b/templates/Application for Confidential address 1.docx
@@ -47,7 +47,27 @@
           <w:color w:val="202124"/>
           <w:shd w:val="clear" w:color="auto" w:fill="FFFFFF"/>
         </w:rPr>
-        <w:t>TĀMAKI MAKAURAU</w:t>
+        <w:t>{{</w:t>
+      </w:r>
+      <w:proofErr w:type="spellStart"/>
+      <w:r>
+        <w:rPr>
+          <w:rFonts w:cs="Arial"/>
+          <w:b/>
+          <w:color w:val="202124"/>
+          <w:shd w:val="clear" w:color="auto" w:fill="FFFFFF"/>
+        </w:rPr>
+        <w:t>Maori_court_name</w:t>
+      </w:r>
+      <w:proofErr w:type="spellEnd"/>
+      <w:r>
+        <w:rPr>
+          <w:rFonts w:cs="Arial"/>
+          <w:b/>
+          <w:color w:val="202124"/>
+          <w:shd w:val="clear" w:color="auto" w:fill="FFFFFF"/>
+        </w:rPr>
+        <w:t>}}</w:t>
       </w:r>
       <w:r>
         <w:rPr>
@@ -102,13 +122,21 @@
         <w:rPr>
           <w:b/>
         </w:rPr>
-        <w:t>HELD AT AUCKLAND</w:t>
-      </w:r>
-      <w:r>
-        <w:rPr>
-          <w:b/>
-        </w:rPr>
-        <w:t xml:space="preserve"> </w:t>
+        <w:t>HELD AT {{</w:t>
+      </w:r>
+      <w:proofErr w:type="spellStart"/>
+      <w:r>
+        <w:rPr>
+          <w:b/>
+        </w:rPr>
+        <w:t>English_court_name</w:t>
+      </w:r>
+      <w:proofErr w:type="spellEnd"/>
+      <w:r>
+        <w:rPr>
+          <w:b/>
+        </w:rPr>
+        <w:t xml:space="preserve">}} </w:t>
       </w:r>
       <w:r>
         <w:rPr>
@@ -459,76 +487,55 @@
     </w:p>
     <w:p>
       <w:pPr>
+        <w:ind w:left="5040"/>
+        <w:rPr>
+          <w:u w:val="single"/>
+        </w:rPr>
+      </w:pPr>
+      <w:r>
+        <w:rPr>
+          <w:rStyle w:val="normaltextrun"/>
+          <w:rFonts w:cs="Arial"/>
+          <w:u w:val="single"/>
+        </w:rPr>
+        <w:t>_____________</w:t>
+      </w:r>
+      <w:r>
+        <w:rPr>
+          <w:rStyle w:val="tabchar"/>
+          <w:rFonts w:ascii="Calibri" w:hAnsi="Calibri" w:cs="Calibri"/>
+        </w:rPr>
+        <w:tab/>
+      </w:r>
+      <w:r>
+        <w:rPr>
+          <w:rStyle w:val="normaltextrun"/>
+          <w:rFonts w:cs="Arial"/>
+          <w:u w:val="single"/>
+        </w:rPr>
+        <w:t>____</w:t>
+      </w:r>
+      <w:r>
+        <w:rPr>
+          <w:rStyle w:val="eop"/>
+          <w:rFonts w:cs="Arial"/>
+        </w:rPr>
+        <w:t> </w:t>
+      </w:r>
+    </w:p>
+    <w:p>
+      <w:pPr>
         <w:jc w:val="center"/>
-        <w:rPr>
-          <w:u w:val="single"/>
-        </w:rPr>
-      </w:pPr>
-      <w:r>
-        <w:rPr>
-          <w:u w:val="single"/>
-        </w:rPr>
+      </w:pPr>
+      <w:r>
         <w:tab/>
       </w:r>
       <w:r>
-        <w:rPr>
-          <w:u w:val="single"/>
-        </w:rPr>
         <w:tab/>
       </w:r>
       <w:r>
-        <w:rPr>
-          <w:u w:val="single"/>
-        </w:rPr>
         <w:tab/>
       </w:r>
-      <w:r>
-        <w:rPr>
-          <w:u w:val="single"/>
-        </w:rPr>
-        <w:tab/>
-      </w:r>
-      <w:r>
-        <w:rPr>
-          <w:u w:val="single"/>
-        </w:rPr>
-        <w:tab/>
-      </w:r>
-      <w:r>
-        <w:rPr>
-          <w:u w:val="single"/>
-        </w:rPr>
-        <w:tab/>
-      </w:r>
-      <w:r>
-        <w:rPr>
-          <w:u w:val="single"/>
-        </w:rPr>
-        <w:tab/>
-      </w:r>
-      <w:r>
-        <w:rPr>
-          <w:u w:val="single"/>
-        </w:rPr>
-        <w:t>_____________</w:t>
-      </w:r>
-      <w:r>
-        <w:rPr>
-          <w:u w:val="single"/>
-        </w:rPr>
-        <w:tab/>
-      </w:r>
-      <w:r>
-        <w:rPr>
-          <w:u w:val="single"/>
-        </w:rPr>
-        <w:t>____</w:t>
-      </w:r>
-    </w:p>
-    <w:p>
-      <w:pPr>
-        <w:jc w:val="center"/>
-      </w:pPr>
     </w:p>
     <w:p>
       <w:pPr>
@@ -625,21 +632,86 @@
           <w:rFonts w:cs="Arial"/>
           <w:szCs w:val="24"/>
         </w:rPr>
-        <w:t xml:space="preserve">Dated this         </w:t>
+        <w:t>Dated this</w:t>
       </w:r>
       <w:r>
         <w:rPr>
           <w:rFonts w:cs="Arial"/>
           <w:szCs w:val="24"/>
         </w:rPr>
-        <w:t xml:space="preserve">day of                      </w:t>
+        <w:t xml:space="preserve"> </w:t>
       </w:r>
       <w:r>
         <w:rPr>
           <w:rFonts w:cs="Arial"/>
           <w:szCs w:val="24"/>
         </w:rPr>
-        <w:t>2025</w:t>
+        <w:t>{{</w:t>
+      </w:r>
+      <w:proofErr w:type="spellStart"/>
+      <w:r>
+        <w:rPr>
+          <w:rFonts w:cs="Arial"/>
+          <w:szCs w:val="24"/>
+        </w:rPr>
+        <w:t>month_day</w:t>
+      </w:r>
+      <w:proofErr w:type="spellEnd"/>
+      <w:r>
+        <w:rPr>
+          <w:rFonts w:cs="Arial"/>
+          <w:szCs w:val="24"/>
+        </w:rPr>
+        <w:t>}}</w:t>
+      </w:r>
+      <w:r>
+        <w:rPr>
+          <w:rFonts w:cs="Arial"/>
+          <w:szCs w:val="24"/>
+        </w:rPr>
+        <w:t xml:space="preserve"> </w:t>
+      </w:r>
+      <w:r>
+        <w:rPr>
+          <w:rFonts w:cs="Arial"/>
+          <w:szCs w:val="24"/>
+        </w:rPr>
+        <w:t>day of</w:t>
+      </w:r>
+      <w:r>
+        <w:rPr>
+          <w:rFonts w:cs="Arial"/>
+          <w:szCs w:val="24"/>
+        </w:rPr>
+        <w:t xml:space="preserve"> {{</w:t>
+      </w:r>
+      <w:r>
+        <w:rPr>
+          <w:rFonts w:cs="Arial"/>
+          <w:szCs w:val="24"/>
+        </w:rPr>
+        <w:t>month}}</w:t>
+      </w:r>
+      <w:r>
+        <w:rPr>
+          <w:rFonts w:cs="Arial"/>
+          <w:szCs w:val="24"/>
+        </w:rPr>
+        <w:t xml:space="preserve"> </w:t>
+      </w:r>
+      <w:r>
+        <w:rPr>
+          <w:rFonts w:cs="Arial"/>
+          <w:szCs w:val="24"/>
+        </w:rPr>
+        <w:t>202</w:t>
+      </w:r>
+      <w:r>
+        <w:rPr>
+          <w:rFonts w:cs="Arial"/>
+          <w:szCs w:val="24"/>
+        </w:rPr>
+        <w:t>6</w:t>
       </w:r>
     </w:p>
     <w:p>
@@ -655,60 +727,12 @@
     <w:p>
       <w:pPr>
         <w:spacing w:line="240" w:lineRule="atLeast"/>
-        <w:ind w:right="17"/>
+        <w:ind w:left="5760" w:right="17"/>
         <w:jc w:val="center"/>
         <w:rPr>
           <w:u w:val="single"/>
         </w:rPr>
       </w:pPr>
-      <w:r>
-        <w:rPr>
-          <w:u w:val="single"/>
-        </w:rPr>
-        <w:tab/>
-      </w:r>
-      <w:r>
-        <w:rPr>
-          <w:u w:val="single"/>
-        </w:rPr>
-        <w:tab/>
-      </w:r>
-      <w:r>
-        <w:rPr>
-          <w:u w:val="single"/>
-        </w:rPr>
-        <w:tab/>
-      </w:r>
-      <w:r>
-        <w:rPr>
-          <w:u w:val="single"/>
-        </w:rPr>
-        <w:tab/>
-      </w:r>
-      <w:r>
-        <w:rPr>
-          <w:u w:val="single"/>
-        </w:rPr>
-        <w:tab/>
-      </w:r>
-      <w:r>
-        <w:rPr>
-          <w:u w:val="single"/>
-        </w:rPr>
-        <w:tab/>
-      </w:r>
-      <w:r>
-        <w:rPr>
-          <w:u w:val="single"/>
-        </w:rPr>
-        <w:tab/>
-      </w:r>
-      <w:r>
-        <w:rPr>
-          <w:u w:val="single"/>
-        </w:rPr>
-        <w:tab/>
-      </w:r>
       <w:r>
         <w:rPr>
           <w:u w:val="single"/>
@@ -775,7 +799,7 @@
     <w:p>
       <w:pPr>
         <w:spacing w:line="240" w:lineRule="atLeast"/>
-        <w:ind w:right="-136"/>
+        <w:ind w:left="6480" w:right="-136"/>
         <w:rPr>
           <w:rFonts w:cs="Arial"/>
           <w:bCs/>
@@ -788,71 +812,6 @@
           <w:bCs/>
           <w:u w:val="single"/>
         </w:rPr>
-        <w:tab/>
-      </w:r>
-      <w:r>
-        <w:rPr>
-          <w:rFonts w:cs="Arial"/>
-          <w:bCs/>
-          <w:u w:val="single"/>
-        </w:rPr>
-        <w:tab/>
-      </w:r>
-      <w:r>
-        <w:rPr>
-          <w:rFonts w:cs="Arial"/>
-          <w:bCs/>
-          <w:u w:val="single"/>
-        </w:rPr>
-        <w:tab/>
-      </w:r>
-      <w:r>
-        <w:rPr>
-          <w:rFonts w:cs="Arial"/>
-          <w:bCs/>
-          <w:u w:val="single"/>
-        </w:rPr>
-        <w:tab/>
-      </w:r>
-      <w:r>
-        <w:rPr>
-          <w:rFonts w:cs="Arial"/>
-          <w:bCs/>
-          <w:u w:val="single"/>
-        </w:rPr>
-        <w:tab/>
-      </w:r>
-      <w:r>
-        <w:rPr>
-          <w:rFonts w:cs="Arial"/>
-          <w:bCs/>
-          <w:u w:val="single"/>
-        </w:rPr>
-        <w:tab/>
-      </w:r>
-      <w:r>
-        <w:rPr>
-          <w:rFonts w:cs="Arial"/>
-          <w:bCs/>
-          <w:u w:val="single"/>
-        </w:rPr>
-        <w:tab/>
-      </w:r>
-      <w:r>
-        <w:rPr>
-          <w:rFonts w:cs="Arial"/>
-          <w:bCs/>
-          <w:u w:val="single"/>
-        </w:rPr>
-        <w:tab/>
-      </w:r>
-      <w:r>
-        <w:rPr>
-          <w:rFonts w:cs="Arial"/>
-          <w:bCs/>
-          <w:u w:val="single"/>
-        </w:rPr>
-        <w:tab/>
         <w:t>___________</w:t>
       </w:r>
     </w:p>
@@ -1013,6 +972,20 @@
     </w:p>
     <w:p>
       <w:pPr>
+        <w:rPr>
+          <w:b/>
+        </w:rPr>
+      </w:pPr>
+      <w:r>
+        <w:rPr>
+          <w:b/>
+        </w:rPr>
+        <w:lastRenderedPageBreak/>
+        <w:br w:type="page"/>
+      </w:r>
+    </w:p>
+    <w:p>
+      <w:pPr>
         <w:spacing w:line="240" w:lineRule="atLeast"/>
         <w:ind w:right="17"/>
         <w:jc w:val="center"/>
@@ -1076,7 +1049,10 @@
         <w:t>C</w:t>
       </w:r>
       <w:r>
-        <w:t>ourt, Auckland</w:t>
+        <w:t xml:space="preserve">ourt, </w:t>
+      </w:r>
+      <w:r>
+        <w:t>{{court}}</w:t>
       </w:r>
     </w:p>
     <w:p>
@@ -1147,7 +1123,7 @@
           <w:rFonts w:cs="Arial"/>
           <w:b/>
         </w:rPr>
-        <w:t>NAME}</w:t>
+        <w:t>NAME}}</w:t>
       </w:r>
       <w:r>
         <w:rPr>
@@ -3545,6 +3521,21 @@
       <w:lang w:eastAsia="en-US"/>
     </w:rPr>
   </w:style>
+  <w:style w:type="character" w:customStyle="1" w:styleId="normaltextrun">
+    <w:name w:val="normaltextrun"/>
+    <w:basedOn w:val="DefaultParagraphFont"/>
+    <w:rsid w:val="00115990"/>
+  </w:style>
+  <w:style w:type="character" w:customStyle="1" w:styleId="tabchar">
+    <w:name w:val="tabchar"/>
+    <w:basedOn w:val="DefaultParagraphFont"/>
+    <w:rsid w:val="00115990"/>
+  </w:style>
+  <w:style w:type="character" w:customStyle="1" w:styleId="eop">
+    <w:name w:val="eop"/>
+    <w:basedOn w:val="DefaultParagraphFont"/>
+    <w:rsid w:val="00115990"/>
+  </w:style>
 </w:styles>
 </file>
 

</xml_diff>

<commit_message>
Standardize family violence intake documents
</commit_message>
<xml_diff>
--- a/templates/Application for Confidential address 1.docx
+++ b/templates/Application for Confidential address 1.docx
@@ -487,7 +487,7 @@
     </w:p>
     <w:p>
       <w:pPr>
-        <w:ind w:left="5040"/>
+        <w:ind w:left="5040" w:firstLine="720"/>
         <w:rPr>
           <w:u w:val="single"/>
         </w:rPr>
@@ -498,22 +498,7 @@
           <w:rFonts w:cs="Arial"/>
           <w:u w:val="single"/>
         </w:rPr>
-        <w:t>_____________</w:t>
-      </w:r>
-      <w:r>
-        <w:rPr>
-          <w:rStyle w:val="tabchar"/>
-          <w:rFonts w:ascii="Calibri" w:hAnsi="Calibri" w:cs="Calibri"/>
-        </w:rPr>
-        <w:tab/>
-      </w:r>
-      <w:r>
-        <w:rPr>
-          <w:rStyle w:val="normaltextrun"/>
-          <w:rFonts w:cs="Arial"/>
-          <w:u w:val="single"/>
-        </w:rPr>
-        <w:t>____</w:t>
+        <w:t>________________</w:t>
       </w:r>
       <w:r>
         <w:rPr>
@@ -1123,7 +1108,7 @@
           <w:rFonts w:cs="Arial"/>
           <w:b/>
         </w:rPr>
-        <w:t>NAME}}</w:t>
+        <w:t>NAME}</w:t>
       </w:r>
       <w:r>
         <w:rPr>

</xml_diff>

<commit_message>
White-label New Gen demo templates
</commit_message>
<xml_diff>
--- a/templates/Application for Confidential address 1.docx
+++ b/templates/Application for Confidential address 1.docx
@@ -844,7 +844,7 @@
           <w:rFonts w:cs="Arial"/>
           <w:bCs/>
         </w:rPr>
-        <w:t>Natalie Quirke</w:t>
+        <w:t>NEW GEN AUTOMATION</w:t>
       </w:r>
     </w:p>
     <w:p>
@@ -878,7 +878,7 @@
           <w:rFonts w:cs="Arial"/>
           <w:bCs/>
         </w:rPr>
-        <w:t>P O Box 25-977</w:t>
+        <w:t>Auckland 1010</w:t>
       </w:r>
     </w:p>
     <w:p>
@@ -895,7 +895,7 @@
           <w:rFonts w:cs="Arial"/>
           <w:bCs/>
         </w:rPr>
-        <w:t>St Heliers 1070</w:t>
+        <w:t>Auckland 1010</w:t>
       </w:r>
     </w:p>
     <w:p>
@@ -1233,7 +1233,7 @@
         <w:jc w:val="both"/>
       </w:pPr>
       <w:r>
-        <w:t>N M Quirke</w:t>
+        <w:t>N M Automation</w:t>
       </w:r>
     </w:p>
     <w:p>
@@ -1320,7 +1320,7 @@
         <w:fldChar w:fldCharType="end"/>
       </w:r>
       <w:r>
-        <w:t xml:space="preserve"> is filed by Natalie Quirke, Barrister and Solicitor for the Applicant</w:t>
+        <w:t xml:space="preserve"> is filed by NEW GEN AUTOMATION, Barrister and Solicitor for the Applicant</w:t>
       </w:r>
       <w:r>
         <w:fldChar w:fldCharType="begin"/>
@@ -1366,7 +1366,7 @@
         <w:t>Posted to counsel at PO</w:t>
       </w:r>
       <w:r>
-        <w:t xml:space="preserve"> Box 25 977, St Heliers 1070</w:t>
+        <w:t xml:space="preserve"> Box 25 977, Auckland 1010</w:t>
       </w:r>
     </w:p>
     <w:p>

</xml_diff>

<commit_message>
Fix demo contact details in templates
</commit_message>
<xml_diff>
--- a/templates/Application for Confidential address 1.docx
+++ b/templates/Application for Confidential address 1.docx
@@ -895,7 +895,7 @@
           <w:rFonts w:cs="Arial"/>
           <w:bCs/>
         </w:rPr>
-        <w:t>Auckland 1010</w:t>
+        <w:t xml:space="preserve">Ph: (09) 235 5523 </w:t>
       </w:r>
     </w:p>
     <w:p>
@@ -912,24 +912,7 @@
           <w:rFonts w:cs="Arial"/>
           <w:bCs/>
         </w:rPr>
-        <w:t xml:space="preserve">Ph:  (09) 575 6757 </w:t>
-      </w:r>
-    </w:p>
-    <w:p>
-      <w:pPr>
-        <w:spacing w:line="240" w:lineRule="atLeast"/>
-        <w:ind w:right="-136"/>
-        <w:rPr>
-          <w:rFonts w:cs="Arial"/>
-          <w:bCs/>
-        </w:rPr>
-      </w:pPr>
-      <w:r>
-        <w:rPr>
-          <w:rFonts w:cs="Arial"/>
-          <w:bCs/>
-        </w:rPr>
-        <w:t>Mobile: 0274 944 411</w:t>
+        <w:t>Mobile: 027 230 5006</w:t>
       </w:r>
     </w:p>
     <w:p>
@@ -1366,7 +1349,7 @@
         <w:t>Posted to counsel at PO</w:t>
       </w:r>
       <w:r>
-        <w:t xml:space="preserve"> Box 25 977, Auckland 1010</w:t>
+        <w:t xml:space="preserve"> New Gen Automation, Auckland 1010</w:t>
       </w:r>
     </w:p>
     <w:p>

</xml_diff>

<commit_message>
Strengthen document templating workflow
</commit_message>
<xml_diff>
--- a/templates/Application for Confidential address 1.docx
+++ b/templates/Application for Confidential address 1.docx
@@ -1,8 +1,8 @@
 
 <file path=word/document.xml><?xml version="1.0" encoding="utf-8"?>
-<w:document xmlns:wpc="http://schemas.microsoft.com/office/word/2010/wordprocessingCanvas" xmlns:cx="http://schemas.microsoft.com/office/drawing/2014/chartex" xmlns:cx1="http://schemas.microsoft.com/office/drawing/2015/9/8/chartex" xmlns:cx2="http://schemas.microsoft.com/office/drawing/2015/10/21/chartex" xmlns:cx3="http://schemas.microsoft.com/office/drawing/2016/5/9/chartex" xmlns:cx4="http://schemas.microsoft.com/office/drawing/2016/5/10/chartex" xmlns:cx5="http://schemas.microsoft.com/office/drawing/2016/5/11/chartex" xmlns:cx6="http://schemas.microsoft.com/office/drawing/2016/5/12/chartex" xmlns:cx7="http://schemas.microsoft.com/office/drawing/2016/5/13/chartex" xmlns:cx8="http://schemas.microsoft.com/office/drawing/2016/5/14/chartex" xmlns:mc="http://schemas.openxmlformats.org/markup-compatibility/2006" xmlns:aink="http://schemas.microsoft.com/office/drawing/2016/ink" xmlns:am3d="http://schemas.microsoft.com/office/drawing/2017/model3d" xmlns:o="urn:schemas-microsoft-com:office:office" xmlns:oel="http://schemas.microsoft.com/office/2019/extlst" xmlns:r="http://schemas.openxmlformats.org/officeDocument/2006/relationships" xmlns:m="http://schemas.openxmlformats.org/officeDocument/2006/math" xmlns:v="urn:schemas-microsoft-com:vml" xmlns:wp14="http://schemas.microsoft.com/office/word/2010/wordprocessingDrawing" xmlns:wp="http://schemas.openxmlformats.org/drawingml/2006/wordprocessingDrawing" xmlns:w10="urn:schemas-microsoft-com:office:word" xmlns:w="http://schemas.openxmlformats.org/wordprocessingml/2006/main" xmlns:w14="http://schemas.microsoft.com/office/word/2010/wordml" xmlns:w15="http://schemas.microsoft.com/office/word/2012/wordml" xmlns:w16cex="http://schemas.microsoft.com/office/word/2018/wordml/cex" xmlns:w16cid="http://schemas.microsoft.com/office/word/2016/wordml/cid" xmlns:w16="http://schemas.microsoft.com/office/word/2018/wordml" xmlns:w16du="http://schemas.microsoft.com/office/word/2023/wordml/word16du" xmlns:w16sdtdh="http://schemas.microsoft.com/office/word/2020/wordml/sdtdatahash" xmlns:w16sdtfl="http://schemas.microsoft.com/office/word/2024/wordml/sdtformatlock" xmlns:w16se="http://schemas.microsoft.com/office/word/2015/wordml/symex" xmlns:wpg="http://schemas.microsoft.com/office/word/2010/wordprocessingGroup" xmlns:wpi="http://schemas.microsoft.com/office/word/2010/wordprocessingInk" xmlns:wne="http://schemas.microsoft.com/office/word/2006/wordml" xmlns:wps="http://schemas.microsoft.com/office/word/2010/wordprocessingShape" mc:Ignorable="w14 w15 w16se w16cid w16 w16cex w16sdtdh w16sdtfl w16du wp14">
+<w:document xmlns:ns1="http://schemas.openxmlformats.org/markup-compatibility/2006" xmlns:ns2="http://schemas.microsoft.com/office/word/2010/wordml" xmlns:w="http://schemas.openxmlformats.org/wordprocessingml/2006/main" ns1:Ignorable="w14 w15 w16se w16cid w16 w16cex w16sdtdh w16sdtfl w16du wp14">
   <w:body>
-    <w:p>
+    <w:p ns2:paraId="40D63A3F" ns2:textId="77777777">
       <w:pPr>
         <w:ind w:right="-136"/>
         <w:rPr>
@@ -26,7 +26,7 @@
         <w:t xml:space="preserve"> </w:t>
       </w:r>
     </w:p>
-    <w:p>
+    <w:p ns2:paraId="758556A7" ns2:textId="77777777">
       <w:pPr>
         <w:ind w:right="-136"/>
         <w:rPr>
@@ -47,7 +47,7 @@
           <w:color w:val="202124"/>
           <w:shd w:val="clear" w:color="auto" w:fill="FFFFFF"/>
         </w:rPr>
-        <w:t>{{</w:t>
+        <w:t>{{court_location_maori}}</w:t>
       </w:r>
       <w:proofErr w:type="spellStart"/>
       <w:r>
@@ -57,7 +57,7 @@
           <w:color w:val="202124"/>
           <w:shd w:val="clear" w:color="auto" w:fill="FFFFFF"/>
         </w:rPr>
-        <w:t>Maori_court_name</w:t>
+        <w:t/>
       </w:r>
       <w:proofErr w:type="spellEnd"/>
       <w:r>
@@ -67,7 +67,7 @@
           <w:color w:val="202124"/>
           <w:shd w:val="clear" w:color="auto" w:fill="FFFFFF"/>
         </w:rPr>
-        <w:t>}}</w:t>
+        <w:t/>
       </w:r>
       <w:r>
         <w:rPr>
@@ -76,7 +76,7 @@
         <w:t xml:space="preserve"> </w:t>
       </w:r>
     </w:p>
-    <w:p>
+    <w:p ns2:paraId="175A47B8" ns2:textId="77777777">
       <w:pPr>
         <w:ind w:right="-136"/>
         <w:rPr>
@@ -84,7 +84,7 @@
         </w:rPr>
       </w:pPr>
     </w:p>
-    <w:p>
+    <w:p ns2:paraId="7D7E2BD7" ns2:textId="77777777">
       <w:pPr>
         <w:ind w:right="-136"/>
         <w:rPr>
@@ -111,7 +111,7 @@
         <w:t>COURT</w:t>
       </w:r>
     </w:p>
-    <w:p>
+    <w:p ns2:paraId="6C64DAAD" ns2:textId="77777777">
       <w:pPr>
         <w:ind w:right="-136"/>
         <w:rPr>
@@ -122,21 +122,21 @@
         <w:rPr>
           <w:b/>
         </w:rPr>
-        <w:t>HELD AT {{</w:t>
+        <w:t>HELD AT {{court_location}}</w:t>
       </w:r>
       <w:proofErr w:type="spellStart"/>
       <w:r>
         <w:rPr>
           <w:b/>
         </w:rPr>
-        <w:t>English_court_name</w:t>
+        <w:t/>
       </w:r>
       <w:proofErr w:type="spellEnd"/>
       <w:r>
         <w:rPr>
           <w:b/>
         </w:rPr>
-        <w:t xml:space="preserve">}} </w:t>
+        <w:t xml:space="preserve"> </w:t>
       </w:r>
       <w:r>
         <w:rPr>
@@ -157,7 +157,7 @@
         <w:fldChar w:fldCharType="end"/>
       </w:r>
     </w:p>
-    <w:p>
+    <w:p ns2:paraId="2AF336AF" ns2:textId="77777777">
       <w:pPr>
         <w:ind w:right="-136"/>
         <w:rPr>
@@ -165,7 +165,7 @@
         </w:rPr>
       </w:pPr>
     </w:p>
-    <w:p>
+    <w:p ns2:paraId="2AF336B0" ns2:textId="77777777">
       <w:pPr>
         <w:ind w:left="4255" w:right="-136"/>
         <w:rPr>
@@ -179,7 +179,7 @@
         <w:t xml:space="preserve">FAM NO.  </w:t>
       </w:r>
     </w:p>
-    <w:p>
+    <w:p ns2:paraId="2AF336B2" ns2:textId="77777777">
       <w:pPr>
         <w:ind w:left="2835" w:right="-136"/>
         <w:jc w:val="both"/>
@@ -188,7 +188,7 @@
         </w:rPr>
       </w:pPr>
     </w:p>
-    <w:p>
+    <w:p ns2:paraId="2AF336B3" ns2:textId="77777777">
       <w:pPr>
         <w:tabs>
           <w:tab w:val="left" w:pos="2880"/>
@@ -213,7 +213,7 @@
         <w:t>Family Violence Act 2018</w:t>
       </w:r>
     </w:p>
-    <w:p>
+    <w:p ns2:paraId="2AF336B4" ns2:textId="77777777">
       <w:pPr>
         <w:ind w:left="2835" w:right="-136"/>
         <w:jc w:val="both"/>
@@ -222,7 +222,7 @@
         </w:rPr>
       </w:pPr>
     </w:p>
-    <w:p>
+    <w:p ns2:paraId="2AF336B5" ns2:textId="77777777">
       <w:pPr>
         <w:ind w:left="2835" w:right="-136"/>
         <w:jc w:val="both"/>
@@ -231,7 +231,7 @@
         </w:rPr>
       </w:pPr>
     </w:p>
-    <w:p>
+    <w:p ns2:paraId="5F23AC71" ns2:textId="521517D5">
       <w:pPr>
         <w:tabs>
           <w:tab w:val="left" w:pos="2880"/>
@@ -260,7 +260,7 @@
           <w:b/>
           <w:bCs/>
         </w:rPr>
-        <w:t>{{APPLICANT_NAME}}</w:t>
+        <w:t>{{applicant_name}}</w:t>
       </w:r>
       <w:r>
         <w:rPr>
@@ -324,7 +324,7 @@
         <w:t>}}</w:t>
       </w:r>
     </w:p>
-    <w:p>
+    <w:p ns2:paraId="769B5B11" ns2:textId="77777777">
       <w:pPr>
         <w:tabs>
           <w:tab w:val="left" w:pos="2880"/>
@@ -333,7 +333,7 @@
         <w:ind w:left="2705" w:right="-136" w:hanging="1985"/>
       </w:pPr>
     </w:p>
-    <w:p>
+    <w:p ns2:paraId="41018A38" ns2:textId="77777777">
       <w:pPr>
         <w:tabs>
           <w:tab w:val="left" w:pos="2880"/>
@@ -351,7 +351,7 @@
         <w:t>Applicant</w:t>
       </w:r>
     </w:p>
-    <w:p>
+    <w:p ns2:paraId="732067AC" ns2:textId="77777777">
       <w:pPr>
         <w:tabs>
           <w:tab w:val="left" w:pos="2880"/>
@@ -360,7 +360,7 @@
         <w:ind w:left="720" w:right="-136"/>
       </w:pPr>
     </w:p>
-    <w:p>
+    <w:p ns2:paraId="2AF336BB" ns2:textId="3C028DC0">
       <w:pPr>
         <w:tabs>
           <w:tab w:val="left" w:pos="2880"/>
@@ -389,7 +389,7 @@
           <w:rFonts w:cs="Arial"/>
           <w:b/>
         </w:rPr>
-        <w:t>{{RESPONDENT_NAME}}</w:t>
+        <w:t>{{respondent_name}}</w:t>
       </w:r>
       <w:r>
         <w:t xml:space="preserve"> </w:t>
@@ -449,7 +449,7 @@
         <w:t>}}</w:t>
       </w:r>
     </w:p>
-    <w:p>
+    <w:p ns2:paraId="2AF336BC" ns2:textId="77777777">
       <w:pPr>
         <w:tabs>
           <w:tab w:val="left" w:pos="2880"/>
@@ -458,7 +458,7 @@
         <w:ind w:left="2705" w:right="-136" w:hanging="1985"/>
       </w:pPr>
     </w:p>
-    <w:p>
+    <w:p ns2:paraId="2AF336BD" ns2:textId="77777777">
       <w:pPr>
         <w:tabs>
           <w:tab w:val="left" w:pos="2880"/>
@@ -476,7 +476,7 @@
         <w:t>Respondent</w:t>
       </w:r>
     </w:p>
-    <w:p>
+    <w:p ns2:paraId="2AF336C0" ns2:textId="77777777">
       <w:pPr>
         <w:spacing w:line="240" w:lineRule="atLeast"/>
         <w:ind w:left="4820" w:right="-136" w:hanging="1985"/>
@@ -485,7 +485,7 @@
         </w:rPr>
       </w:pPr>
     </w:p>
-    <w:p>
+    <w:p ns2:paraId="2AF336C1" ns2:textId="0820BE17">
       <w:pPr>
         <w:ind w:left="5040" w:firstLine="720"/>
         <w:rPr>
@@ -508,7 +508,7 @@
         <w:t> </w:t>
       </w:r>
     </w:p>
-    <w:p>
+    <w:p ns2:paraId="2AF336C2" ns2:textId="675066F6">
       <w:pPr>
         <w:jc w:val="center"/>
       </w:pPr>
@@ -522,7 +522,7 @@
         <w:tab/>
       </w:r>
     </w:p>
-    <w:p>
+    <w:p ns2:paraId="2AF336C3" ns2:textId="77777777">
       <w:pPr>
         <w:spacing w:line="240" w:lineRule="atLeast"/>
         <w:ind w:right="17"/>
@@ -538,7 +538,7 @@
         <w:t xml:space="preserve">NOTICE OF RESIDENTIAL ADDRESS AND REQUEST FOR CONFIDENTIALITY </w:t>
       </w:r>
     </w:p>
-    <w:p>
+    <w:p ns2:paraId="2AF336C4" ns2:textId="77777777">
       <w:pPr>
         <w:spacing w:line="240" w:lineRule="atLeast"/>
         <w:ind w:right="17"/>
@@ -548,7 +548,7 @@
         </w:rPr>
       </w:pPr>
     </w:p>
-    <w:p>
+    <w:p ns2:paraId="2AF336C5" ns2:textId="77777777">
       <w:pPr>
         <w:spacing w:line="240" w:lineRule="atLeast"/>
         <w:ind w:right="17"/>
@@ -558,7 +558,7 @@
         </w:rPr>
       </w:pPr>
     </w:p>
-    <w:p>
+    <w:p ns2:paraId="2AF336C6" ns2:textId="54C7C1C5">
       <w:pPr>
         <w:spacing w:line="240" w:lineRule="atLeast"/>
         <w:ind w:right="17"/>
@@ -586,7 +586,7 @@
         <w:t>)</w:t>
       </w:r>
     </w:p>
-    <w:p>
+    <w:p ns2:paraId="2AF336C7" ns2:textId="77777777">
       <w:pPr>
         <w:spacing w:line="240" w:lineRule="atLeast"/>
         <w:ind w:right="17"/>
@@ -596,7 +596,7 @@
         </w:rPr>
       </w:pPr>
     </w:p>
-    <w:p>
+    <w:p ns2:paraId="2AF336C8" ns2:textId="77777777">
       <w:pPr>
         <w:spacing w:line="240" w:lineRule="atLeast"/>
         <w:ind w:right="17"/>
@@ -606,7 +606,7 @@
         </w:rPr>
       </w:pPr>
     </w:p>
-    <w:p>
+    <w:p ns2:paraId="2AF336C9" ns2:textId="2DB4D9B1">
       <w:pPr>
         <w:spacing w:line="240" w:lineRule="atLeast"/>
         <w:ind w:right="17"/>
@@ -617,21 +617,21 @@
           <w:rFonts w:cs="Arial"/>
           <w:szCs w:val="24"/>
         </w:rPr>
-        <w:t>Dated this</w:t>
+        <w:t>Dated this {{month_day}} day of {{month}} {{year}}</w:t>
       </w:r>
       <w:r>
         <w:rPr>
           <w:rFonts w:cs="Arial"/>
           <w:szCs w:val="24"/>
         </w:rPr>
-        <w:t xml:space="preserve"> </w:t>
+        <w:t xml:space="preserve"/>
       </w:r>
       <w:r>
         <w:rPr>
           <w:rFonts w:cs="Arial"/>
           <w:szCs w:val="24"/>
         </w:rPr>
-        <w:t>{{</w:t>
+        <w:t/>
       </w:r>
       <w:proofErr w:type="spellStart"/>
       <w:r>
@@ -639,7 +639,7 @@
           <w:rFonts w:cs="Arial"/>
           <w:szCs w:val="24"/>
         </w:rPr>
-        <w:t>month_day</w:t>
+        <w:t/>
       </w:r>
       <w:proofErr w:type="spellEnd"/>
       <w:r>
@@ -647,59 +647,59 @@
           <w:rFonts w:cs="Arial"/>
           <w:szCs w:val="24"/>
         </w:rPr>
-        <w:t>}}</w:t>
+        <w:t/>
       </w:r>
       <w:r>
         <w:rPr>
           <w:rFonts w:cs="Arial"/>
           <w:szCs w:val="24"/>
         </w:rPr>
-        <w:t xml:space="preserve"> </w:t>
+        <w:t xml:space="preserve"/>
       </w:r>
       <w:r>
         <w:rPr>
           <w:rFonts w:cs="Arial"/>
           <w:szCs w:val="24"/>
         </w:rPr>
-        <w:t>day of</w:t>
+        <w:t/>
       </w:r>
       <w:r>
         <w:rPr>
           <w:rFonts w:cs="Arial"/>
           <w:szCs w:val="24"/>
         </w:rPr>
-        <w:t xml:space="preserve"> {{</w:t>
+        <w:t xml:space="preserve"/>
       </w:r>
       <w:r>
         <w:rPr>
           <w:rFonts w:cs="Arial"/>
           <w:szCs w:val="24"/>
         </w:rPr>
-        <w:t>month}}</w:t>
+        <w:t/>
       </w:r>
       <w:r>
         <w:rPr>
           <w:rFonts w:cs="Arial"/>
           <w:szCs w:val="24"/>
         </w:rPr>
-        <w:t xml:space="preserve"> </w:t>
+        <w:t xml:space="preserve"/>
       </w:r>
       <w:r>
         <w:rPr>
           <w:rFonts w:cs="Arial"/>
           <w:szCs w:val="24"/>
         </w:rPr>
-        <w:t>202</w:t>
+        <w:t/>
       </w:r>
       <w:r>
         <w:rPr>
           <w:rFonts w:cs="Arial"/>
           <w:szCs w:val="24"/>
         </w:rPr>
-        <w:t>6</w:t>
-      </w:r>
-    </w:p>
-    <w:p>
+        <w:t/>
+      </w:r>
+    </w:p>
+    <w:p ns2:paraId="2AF336CA" ns2:textId="77777777">
       <w:pPr>
         <w:spacing w:line="240" w:lineRule="atLeast"/>
         <w:ind w:right="17"/>
@@ -709,7 +709,7 @@
         </w:rPr>
       </w:pPr>
     </w:p>
-    <w:p>
+    <w:p ns2:paraId="2AF336CB" ns2:textId="02B85509">
       <w:pPr>
         <w:spacing w:line="240" w:lineRule="atLeast"/>
         <w:ind w:left="5760" w:right="17"/>
@@ -725,7 +725,7 @@
         <w:t>________________</w:t>
       </w:r>
     </w:p>
-    <w:p>
+    <w:p ns2:paraId="2AF336CC" ns2:textId="77777777">
       <w:pPr>
         <w:spacing w:line="240" w:lineRule="atLeast"/>
         <w:ind w:right="1693"/>
@@ -735,7 +735,7 @@
         </w:rPr>
       </w:pPr>
     </w:p>
-    <w:p>
+    <w:p ns2:paraId="2AF336CD" ns2:textId="77777777">
       <w:pPr>
         <w:spacing w:line="240" w:lineRule="atLeast"/>
         <w:ind w:right="1693"/>
@@ -745,7 +745,7 @@
         </w:rPr>
       </w:pPr>
     </w:p>
-    <w:p>
+    <w:p ns2:paraId="2AF336CE" ns2:textId="77777777">
       <w:pPr>
         <w:spacing w:line="240" w:lineRule="atLeast"/>
         <w:ind w:right="1693"/>
@@ -755,7 +755,7 @@
         </w:rPr>
       </w:pPr>
     </w:p>
-    <w:p>
+    <w:p ns2:paraId="2AF336D1" ns2:textId="77777777">
       <w:pPr>
         <w:spacing w:line="240" w:lineRule="atLeast"/>
         <w:ind w:right="1693"/>
@@ -771,7 +771,7 @@
         <w:t xml:space="preserve"> </w:t>
       </w:r>
     </w:p>
-    <w:p>
+    <w:p ns2:paraId="2AF336D2" ns2:textId="77777777">
       <w:pPr>
         <w:spacing w:line="240" w:lineRule="atLeast"/>
         <w:ind w:right="1693"/>
@@ -781,7 +781,7 @@
         </w:rPr>
       </w:pPr>
     </w:p>
-    <w:p>
+    <w:p ns2:paraId="2AF336D3" ns2:textId="264DEB3B">
       <w:pPr>
         <w:spacing w:line="240" w:lineRule="atLeast"/>
         <w:ind w:left="6480" w:right="-136"/>
@@ -800,7 +800,7 @@
         <w:t>___________</w:t>
       </w:r>
     </w:p>
-    <w:p>
+    <w:p ns2:paraId="2AF336D4" ns2:textId="77777777">
       <w:pPr>
         <w:spacing w:line="240" w:lineRule="atLeast"/>
         <w:ind w:right="-136"/>
@@ -811,7 +811,7 @@
         </w:rPr>
       </w:pPr>
     </w:p>
-    <w:p>
+    <w:p ns2:paraId="2AF336D5" ns2:textId="77777777">
       <w:pPr>
         <w:spacing w:line="240" w:lineRule="atLeast"/>
         <w:ind w:right="-136"/>
@@ -830,7 +830,7 @@
         <w:t>This document is filed by</w:t>
       </w:r>
     </w:p>
-    <w:p>
+    <w:p ns2:paraId="2AF336D6" ns2:textId="77777777">
       <w:pPr>
         <w:spacing w:line="240" w:lineRule="atLeast"/>
         <w:ind w:right="-136"/>
@@ -847,7 +847,7 @@
         <w:t>Natalie Quirke</w:t>
       </w:r>
     </w:p>
-    <w:p>
+    <w:p ns2:paraId="2AF336D7" ns2:textId="77777777">
       <w:pPr>
         <w:spacing w:line="240" w:lineRule="atLeast"/>
         <w:ind w:right="-136"/>
@@ -864,7 +864,7 @@
         <w:t>Barrister and Solicitor</w:t>
       </w:r>
     </w:p>
-    <w:p>
+    <w:p ns2:paraId="2AF336D8" ns2:textId="77777777">
       <w:pPr>
         <w:spacing w:line="240" w:lineRule="atLeast"/>
         <w:ind w:right="-136"/>
@@ -881,7 +881,7 @@
         <w:t>P O Box 25-977</w:t>
       </w:r>
     </w:p>
-    <w:p>
+    <w:p ns2:paraId="2AF336D9" ns2:textId="77777777">
       <w:pPr>
         <w:spacing w:line="240" w:lineRule="atLeast"/>
         <w:ind w:right="-136"/>
@@ -898,7 +898,7 @@
         <w:t>St Heliers 1070</w:t>
       </w:r>
     </w:p>
-    <w:p>
+    <w:p ns2:paraId="2AF336DA" ns2:textId="77777777">
       <w:pPr>
         <w:spacing w:line="240" w:lineRule="atLeast"/>
         <w:ind w:right="-136"/>
@@ -915,7 +915,7 @@
         <w:t xml:space="preserve">Ph:  (09) 575 6757 </w:t>
       </w:r>
     </w:p>
-    <w:p>
+    <w:p ns2:paraId="2AF336DB" ns2:textId="77777777">
       <w:pPr>
         <w:spacing w:line="240" w:lineRule="atLeast"/>
         <w:ind w:right="-136"/>
@@ -932,7 +932,7 @@
         <w:t>Mobile: 0274 944 411</w:t>
       </w:r>
     </w:p>
-    <w:p>
+    <w:p ns2:paraId="2AF336DC" ns2:textId="77777777">
       <w:pPr>
         <w:spacing w:line="240" w:lineRule="atLeast"/>
         <w:ind w:right="1693"/>
@@ -942,7 +942,7 @@
         </w:rPr>
       </w:pPr>
     </w:p>
-    <w:p>
+    <w:p ns2:paraId="2AF336DD" ns2:textId="77777777">
       <w:pPr>
         <w:spacing w:line="360" w:lineRule="auto"/>
         <w:rPr>
@@ -955,7 +955,7 @@
         </w:sectPr>
       </w:pPr>
     </w:p>
-    <w:p>
+    <w:p ns2:paraId="171840E2" ns2:textId="77777777">
       <w:pPr>
         <w:rPr>
           <w:b/>
@@ -969,7 +969,7 @@
         <w:br w:type="page"/>
       </w:r>
     </w:p>
-    <w:p>
+    <w:p ns2:paraId="2AF336DE" ns2:textId="06697774">
       <w:pPr>
         <w:spacing w:line="240" w:lineRule="atLeast"/>
         <w:ind w:right="17"/>
@@ -986,14 +986,14 @@
         <w:t xml:space="preserve">NOTICE OF RESIDENTIAL ADDRESS AND REQUEST FOR CONFIDENTIALITY </w:t>
       </w:r>
     </w:p>
-    <w:p>
+    <w:p ns2:paraId="18A8998C" ns2:textId="77777777">
       <w:pPr>
         <w:spacing w:line="240" w:lineRule="atLeast"/>
         <w:ind w:right="17"/>
         <w:jc w:val="center"/>
       </w:pPr>
     </w:p>
-    <w:p>
+    <w:p ns2:paraId="18E5C290" ns2:textId="4D902F7A">
       <w:pPr>
         <w:spacing w:line="240" w:lineRule="atLeast"/>
         <w:ind w:right="17"/>
@@ -1011,7 +1011,7 @@
         <w:t>Rule 311 Family Court Rules 2002)</w:t>
       </w:r>
     </w:p>
-    <w:p>
+    <w:p ns2:paraId="2AF336E0" ns2:textId="5DAC0D8E">
       <w:pPr>
         <w:tabs>
           <w:tab w:val="left" w:pos="0"/>
@@ -1040,7 +1040,7 @@
         <w:t>{{court}}</w:t>
       </w:r>
     </w:p>
-    <w:p>
+    <w:p ns2:paraId="2AF336E1" ns2:textId="1190127C">
       <w:pPr>
         <w:tabs>
           <w:tab w:val="left" w:pos="0"/>
@@ -1064,21 +1064,21 @@
           <w:rFonts w:cs="Arial"/>
           <w:b/>
         </w:rPr>
-        <w:t>{{APPLICANT</w:t>
-      </w:r>
-      <w:r>
-        <w:rPr>
-          <w:rFonts w:cs="Arial"/>
-          <w:b/>
-        </w:rPr>
-        <w:t>_</w:t>
-      </w:r>
-      <w:r>
-        <w:rPr>
-          <w:rFonts w:cs="Arial"/>
-          <w:b/>
-        </w:rPr>
-        <w:t>NAME}}</w:t>
+        <w:t>{{applicant_name}}</w:t>
+      </w:r>
+      <w:r>
+        <w:rPr>
+          <w:rFonts w:cs="Arial"/>
+          <w:b/>
+        </w:rPr>
+        <w:t/>
+      </w:r>
+      <w:r>
+        <w:rPr>
+          <w:rFonts w:cs="Arial"/>
+          <w:b/>
+        </w:rPr>
+        <w:t/>
       </w:r>
       <w:r>
         <w:rPr>
@@ -1094,21 +1094,21 @@
           <w:rFonts w:cs="Arial"/>
           <w:b/>
         </w:rPr>
-        <w:t>{{</w:t>
-      </w:r>
-      <w:r>
-        <w:rPr>
-          <w:rFonts w:cs="Arial"/>
-          <w:b/>
-        </w:rPr>
-        <w:t>RESPONDENT_</w:t>
-      </w:r>
-      <w:r>
-        <w:rPr>
-          <w:rFonts w:cs="Arial"/>
-          <w:b/>
-        </w:rPr>
-        <w:t>NAME}</w:t>
+        <w:t>{{respondent_name}}</w:t>
+      </w:r>
+      <w:r>
+        <w:rPr>
+          <w:rFonts w:cs="Arial"/>
+          <w:b/>
+        </w:rPr>
+        <w:t/>
+      </w:r>
+      <w:r>
+        <w:rPr>
+          <w:rFonts w:cs="Arial"/>
+          <w:b/>
+        </w:rPr>
+        <w:t/>
       </w:r>
       <w:r>
         <w:rPr>
@@ -1120,7 +1120,7 @@
         <w:t xml:space="preserve">the Respondent.  </w:t>
       </w:r>
     </w:p>
-    <w:p>
+    <w:p ns2:paraId="2AF336E2" ns2:textId="56BE9EB4">
       <w:pPr>
         <w:tabs>
           <w:tab w:val="left" w:pos="0"/>
@@ -1176,7 +1176,7 @@
         <w:t xml:space="preserve"> </w:t>
       </w:r>
     </w:p>
-    <w:p>
+    <w:p ns2:paraId="2AF336E3" ns2:textId="77777777">
       <w:pPr>
         <w:tabs>
           <w:tab w:val="left" w:pos="0"/>
@@ -1188,7 +1188,7 @@
         <w:t xml:space="preserve">I request that my residential address be kept confidential from the Respondent. I have provided an address for service on the information sheet accompanying the application. </w:t>
       </w:r>
     </w:p>
-    <w:p>
+    <w:p ns2:paraId="2AF336E4" ns2:textId="77777777">
       <w:pPr>
         <w:tabs>
           <w:tab w:val="left" w:pos="0"/>
@@ -1200,7 +1200,7 @@
         <w:t xml:space="preserve"> </w:t>
       </w:r>
     </w:p>
-    <w:p>
+    <w:p ns2:paraId="2AF336E5" ns2:textId="77777777">
       <w:pPr>
         <w:tabs>
           <w:tab w:val="left" w:pos="0"/>
@@ -1209,7 +1209,7 @@
         <w:jc w:val="both"/>
       </w:pPr>
     </w:p>
-    <w:p>
+    <w:p ns2:paraId="2AF336E6" ns2:textId="77777777">
       <w:pPr>
         <w:tabs>
           <w:tab w:val="left" w:pos="0"/>
@@ -1218,7 +1218,7 @@
         <w:jc w:val="both"/>
       </w:pPr>
     </w:p>
-    <w:p>
+    <w:p ns2:paraId="2AF336E7" ns2:textId="77777777">
       <w:pPr>
         <w:ind w:right="197"/>
         <w:jc w:val="both"/>
@@ -1227,7 +1227,7 @@
         <w:t>...................................................</w:t>
       </w:r>
     </w:p>
-    <w:p>
+    <w:p ns2:paraId="2AF336E8" ns2:textId="77777777">
       <w:pPr>
         <w:ind w:right="197"/>
         <w:jc w:val="both"/>
@@ -1236,7 +1236,7 @@
         <w:t>N M Quirke</w:t>
       </w:r>
     </w:p>
-    <w:p>
+    <w:p ns2:paraId="2AF336E9" ns2:textId="77777777">
       <w:pPr>
         <w:ind w:right="197"/>
         <w:jc w:val="both"/>
@@ -1245,34 +1245,34 @@
         <w:t>Counsel for Applicant</w:t>
       </w:r>
     </w:p>
-    <w:p>
+    <w:p ns2:paraId="2AF336EA" ns2:textId="77777777">
       <w:pPr>
         <w:ind w:right="197"/>
         <w:jc w:val="both"/>
       </w:pPr>
     </w:p>
-    <w:p>
+    <w:p ns2:paraId="2AF336EB" ns2:textId="77777777">
       <w:pPr>
         <w:ind w:right="197"/>
         <w:jc w:val="both"/>
       </w:pPr>
     </w:p>
-    <w:p>
+    <w:p ns2:paraId="123663A7" ns2:textId="61F86AAD">
       <w:pPr>
         <w:ind w:right="197"/>
         <w:jc w:val="both"/>
       </w:pPr>
       <w:r>
-        <w:t>{{</w:t>
-      </w:r>
-      <w:r>
-        <w:t>todays_date</w:t>
-      </w:r>
-      <w:r>
-        <w:t>}}</w:t>
-      </w:r>
-    </w:p>
-    <w:p>
+        <w:t>{{date_today}}</w:t>
+      </w:r>
+      <w:r>
+        <w:t/>
+      </w:r>
+      <w:r>
+        <w:t/>
+      </w:r>
+    </w:p>
+    <w:p ns2:paraId="2AF336ED" ns2:textId="1D0CE192">
       <w:pPr>
         <w:ind w:right="197"/>
         <w:jc w:val="both"/>
@@ -1281,7 +1281,7 @@
         <w:t>Date</w:t>
       </w:r>
     </w:p>
-    <w:p>
+    <w:p ns2:paraId="2AF336EE" ns2:textId="77777777">
       <w:pPr>
         <w:tabs>
           <w:tab w:val="left" w:pos="0"/>
@@ -1291,7 +1291,7 @@
         <w:jc w:val="both"/>
       </w:pPr>
     </w:p>
-    <w:p>
+    <w:p ns2:paraId="2AF336EF" ns2:textId="77777777">
       <w:pPr>
         <w:tabs>
           <w:tab w:val="left" w:pos="0"/>
@@ -1301,7 +1301,7 @@
         <w:jc w:val="both"/>
       </w:pPr>
     </w:p>
-    <w:p>
+    <w:p ns2:paraId="2AF336F0" ns2:textId="77777777">
       <w:pPr>
         <w:pStyle w:val="BodyText20"/>
         <w:spacing w:line="240" w:lineRule="auto"/>
@@ -1335,13 +1335,13 @@
         <w:t xml:space="preserve"> </w:t>
       </w:r>
     </w:p>
-    <w:p>
+    <w:p ns2:paraId="2AF336F1" ns2:textId="77777777">
       <w:pPr>
         <w:pStyle w:val="BodyText20"/>
         <w:ind w:right="197"/>
       </w:pPr>
     </w:p>
-    <w:p>
+    <w:p ns2:paraId="2AF336F2" ns2:textId="77777777">
       <w:pPr>
         <w:ind w:right="197"/>
       </w:pPr>
@@ -1349,12 +1349,12 @@
         <w:t>Documents for service may be left at the address for service or may be:</w:t>
       </w:r>
     </w:p>
-    <w:p>
+    <w:p ns2:paraId="2AF336F3" ns2:textId="77777777">
       <w:pPr>
         <w:ind w:right="197"/>
       </w:pPr>
     </w:p>
-    <w:p>
+    <w:p ns2:paraId="2AF336F4" ns2:textId="77777777">
       <w:pPr>
         <w:ind w:left="851" w:right="197" w:hanging="851"/>
       </w:pPr>
@@ -1369,12 +1369,12 @@
         <w:t xml:space="preserve"> Box 25 977, St Heliers 1070</w:t>
       </w:r>
     </w:p>
-    <w:p>
+    <w:p ns2:paraId="2AF336F5" ns2:textId="77777777">
       <w:pPr>
         <w:ind w:right="197"/>
       </w:pPr>
     </w:p>
-    <w:p>
+    <w:p ns2:paraId="2AF336F6" ns2:textId="77777777">
       <w:pPr>
         <w:ind w:right="197"/>
       </w:pPr>
@@ -1382,7 +1382,7 @@
         <w:t xml:space="preserve"> </w:t>
       </w:r>
     </w:p>
-    <w:p>
+    <w:p ns2:paraId="2AF336F7" ns2:textId="77777777">
       <w:pPr>
         <w:tabs>
           <w:tab w:val="left" w:pos="0"/>
@@ -1392,7 +1392,7 @@
         <w:jc w:val="both"/>
       </w:pPr>
     </w:p>
-    <w:p>
+    <w:p ns2:paraId="2AF336F8" ns2:textId="77777777">
       <w:r>
         <w:t xml:space="preserve"> </w:t>
       </w:r>

</xml_diff>